<commit_message>
Spring 1-2 update to propose plans a and b in sprint 2: a in case it is extended and b in case the project ends on September 16th
</commit_message>
<xml_diff>
--- a/docs/Sprints_daylists/Sprint1_2.docx
+++ b/docs/Sprints_daylists/Sprint1_2.docx
@@ -859,6 +859,1149 @@
         <w:t xml:space="preserve"> dejar los datos limpios y trazables, ejecutar el análisis exploratorio, entrenar y validar el modelo de devoluciones, y entregar el documento final (Entregable 2).</w:t>
       </w:r>
     </w:p>
+    <w:p>
+      <w:pPr>
+        <w:rPr>
+          <w:rFonts w:ascii="Times New Roman" w:hAnsi="Times New Roman" w:cs="Times New Roman"/>
+          <w:b/>
+          <w:bCs/>
+        </w:rPr>
+      </w:pPr>
+      <w:r>
+        <w:rPr>
+          <w:rFonts w:ascii="Times New Roman" w:hAnsi="Times New Roman" w:cs="Times New Roman"/>
+          <w:b/>
+          <w:bCs/>
+        </w:rPr>
+        <w:t>Opción A — Cronograma extendido (semanas 5–14, hasta finales de octubre)</w:t>
+      </w:r>
+    </w:p>
+    <w:tbl>
+      <w:tblPr>
+        <w:tblW w:w="0" w:type="auto"/>
+        <w:tblCellSpacing w:w="15" w:type="dxa"/>
+        <w:tblBorders>
+          <w:top w:val="single" w:sz="4" w:space="0" w:color="auto"/>
+          <w:left w:val="single" w:sz="4" w:space="0" w:color="auto"/>
+          <w:bottom w:val="single" w:sz="4" w:space="0" w:color="auto"/>
+          <w:right w:val="single" w:sz="4" w:space="0" w:color="auto"/>
+          <w:insideH w:val="single" w:sz="4" w:space="0" w:color="auto"/>
+          <w:insideV w:val="single" w:sz="4" w:space="0" w:color="auto"/>
+        </w:tblBorders>
+        <w:tblCellMar>
+          <w:top w:w="15" w:type="dxa"/>
+          <w:left w:w="15" w:type="dxa"/>
+          <w:bottom w:w="15" w:type="dxa"/>
+          <w:right w:w="15" w:type="dxa"/>
+        </w:tblCellMar>
+        <w:tblLook w:val="04A0" w:firstRow="1" w:lastRow="0" w:firstColumn="1" w:lastColumn="0" w:noHBand="0" w:noVBand="1"/>
+      </w:tblPr>
+      <w:tblGrid>
+        <w:gridCol w:w="909"/>
+        <w:gridCol w:w="919"/>
+        <w:gridCol w:w="5243"/>
+        <w:gridCol w:w="1423"/>
+      </w:tblGrid>
+      <w:tr>
+        <w:trPr>
+          <w:tblHeader/>
+          <w:tblCellSpacing w:w="15" w:type="dxa"/>
+        </w:trPr>
+        <w:tc>
+          <w:tcPr>
+            <w:tcW w:w="0" w:type="auto"/>
+            <w:vAlign w:val="center"/>
+          </w:tcPr>
+          <w:p>
+            <w:pPr>
+              <w:rPr>
+                <w:rFonts w:ascii="Times New Roman" w:hAnsi="Times New Roman" w:cs="Times New Roman"/>
+                <w:b/>
+                <w:bCs/>
+              </w:rPr>
+            </w:pPr>
+            <w:r>
+              <w:rPr>
+                <w:rFonts w:ascii="Times New Roman" w:hAnsi="Times New Roman" w:cs="Times New Roman"/>
+                <w:b/>
+                <w:bCs/>
+              </w:rPr>
+              <w:t>Semana</w:t>
+            </w:r>
+          </w:p>
+        </w:tc>
+        <w:tc>
+          <w:tcPr>
+            <w:tcW w:w="0" w:type="auto"/>
+            <w:vAlign w:val="center"/>
+          </w:tcPr>
+          <w:p>
+            <w:pPr>
+              <w:rPr>
+                <w:rFonts w:ascii="Times New Roman" w:hAnsi="Times New Roman" w:cs="Times New Roman"/>
+                <w:b/>
+                <w:bCs/>
+              </w:rPr>
+            </w:pPr>
+            <w:r>
+              <w:rPr>
+                <w:rFonts w:ascii="Times New Roman" w:hAnsi="Times New Roman" w:cs="Times New Roman"/>
+                <w:b/>
+                <w:bCs/>
+              </w:rPr>
+              <w:t>Fechas</w:t>
+            </w:r>
+          </w:p>
+        </w:tc>
+        <w:tc>
+          <w:tcPr>
+            <w:tcW w:w="0" w:type="auto"/>
+            <w:vAlign w:val="center"/>
+          </w:tcPr>
+          <w:p>
+            <w:pPr>
+              <w:rPr>
+                <w:rFonts w:ascii="Times New Roman" w:hAnsi="Times New Roman" w:cs="Times New Roman"/>
+                <w:b/>
+                <w:bCs/>
+              </w:rPr>
+            </w:pPr>
+            <w:r>
+              <w:rPr>
+                <w:rFonts w:ascii="Times New Roman" w:hAnsi="Times New Roman" w:cs="Times New Roman"/>
+                <w:b/>
+                <w:bCs/>
+              </w:rPr>
+              <w:t>Actividad</w:t>
+            </w:r>
+          </w:p>
+        </w:tc>
+        <w:tc>
+          <w:tcPr>
+            <w:tcW w:w="0" w:type="auto"/>
+            <w:vAlign w:val="center"/>
+          </w:tcPr>
+          <w:p>
+            <w:pPr>
+              <w:rPr>
+                <w:rFonts w:ascii="Times New Roman" w:hAnsi="Times New Roman" w:cs="Times New Roman"/>
+                <w:b/>
+                <w:bCs/>
+              </w:rPr>
+            </w:pPr>
+            <w:r>
+              <w:rPr>
+                <w:rFonts w:ascii="Times New Roman" w:hAnsi="Times New Roman" w:cs="Times New Roman"/>
+                <w:b/>
+                <w:bCs/>
+              </w:rPr>
+              <w:t>Responsable</w:t>
+            </w:r>
+          </w:p>
+        </w:tc>
+      </w:tr>
+      <w:tr>
+        <w:trPr>
+          <w:tblCellSpacing w:w="15" w:type="dxa"/>
+        </w:trPr>
+        <w:tc>
+          <w:tcPr>
+            <w:tcW w:w="0" w:type="auto"/>
+            <w:vAlign w:val="center"/>
+          </w:tcPr>
+          <w:p>
+            <w:pPr>
+              <w:rPr>
+                <w:rFonts w:ascii="Times New Roman" w:hAnsi="Times New Roman" w:cs="Times New Roman"/>
+              </w:rPr>
+            </w:pPr>
+            <w:r>
+              <w:rPr>
+                <w:rFonts w:ascii="Times New Roman" w:hAnsi="Times New Roman" w:cs="Times New Roman"/>
+              </w:rPr>
+              <w:t>5</w:t>
+            </w:r>
+          </w:p>
+        </w:tc>
+        <w:tc>
+          <w:tcPr>
+            <w:tcW w:w="0" w:type="auto"/>
+            <w:vAlign w:val="center"/>
+          </w:tcPr>
+          <w:p>
+            <w:pPr>
+              <w:rPr>
+                <w:rFonts w:ascii="Times New Roman" w:hAnsi="Times New Roman" w:cs="Times New Roman"/>
+              </w:rPr>
+            </w:pPr>
+            <w:r>
+              <w:rPr>
+                <w:rFonts w:ascii="Times New Roman" w:hAnsi="Times New Roman" w:cs="Times New Roman"/>
+              </w:rPr>
+              <w:t xml:space="preserve">19–25 </w:t>
+            </w:r>
+            <w:proofErr w:type="spellStart"/>
+            <w:r>
+              <w:rPr>
+                <w:rFonts w:ascii="Times New Roman" w:hAnsi="Times New Roman" w:cs="Times New Roman"/>
+              </w:rPr>
+              <w:t>ago</w:t>
+            </w:r>
+            <w:proofErr w:type="spellEnd"/>
+          </w:p>
+        </w:tc>
+        <w:tc>
+          <w:tcPr>
+            <w:tcW w:w="0" w:type="auto"/>
+            <w:vAlign w:val="center"/>
+          </w:tcPr>
+          <w:p>
+            <w:pPr>
+              <w:rPr>
+                <w:rFonts w:ascii="Times New Roman" w:hAnsi="Times New Roman" w:cs="Times New Roman"/>
+              </w:rPr>
+            </w:pPr>
+            <w:r>
+              <w:rPr>
+                <w:rFonts w:ascii="Times New Roman" w:hAnsi="Times New Roman" w:cs="Times New Roman"/>
+              </w:rPr>
+              <w:t>Auditoría de calidad de las fuentes (completitud, consistencia, trazabilidad) y cierre formal del Entregable 1</w:t>
+            </w:r>
+          </w:p>
+        </w:tc>
+        <w:tc>
+          <w:tcPr>
+            <w:tcW w:w="0" w:type="auto"/>
+            <w:vAlign w:val="center"/>
+          </w:tcPr>
+          <w:p>
+            <w:pPr>
+              <w:rPr>
+                <w:rFonts w:ascii="Times New Roman" w:hAnsi="Times New Roman" w:cs="Times New Roman"/>
+              </w:rPr>
+            </w:pPr>
+            <w:r>
+              <w:rPr>
+                <w:rFonts w:ascii="Times New Roman" w:hAnsi="Times New Roman" w:cs="Times New Roman"/>
+              </w:rPr>
+              <w:t>Néstor / Ivanna</w:t>
+            </w:r>
+          </w:p>
+        </w:tc>
+      </w:tr>
+      <w:tr>
+        <w:trPr>
+          <w:tblCellSpacing w:w="15" w:type="dxa"/>
+        </w:trPr>
+        <w:tc>
+          <w:tcPr>
+            <w:tcW w:w="0" w:type="auto"/>
+            <w:vAlign w:val="center"/>
+          </w:tcPr>
+          <w:p>
+            <w:pPr>
+              <w:rPr>
+                <w:rFonts w:ascii="Times New Roman" w:hAnsi="Times New Roman" w:cs="Times New Roman"/>
+              </w:rPr>
+            </w:pPr>
+            <w:r>
+              <w:rPr>
+                <w:rFonts w:ascii="Times New Roman" w:hAnsi="Times New Roman" w:cs="Times New Roman"/>
+              </w:rPr>
+              <w:t>6</w:t>
+            </w:r>
+          </w:p>
+        </w:tc>
+        <w:tc>
+          <w:tcPr>
+            <w:tcW w:w="0" w:type="auto"/>
+            <w:vAlign w:val="center"/>
+          </w:tcPr>
+          <w:p>
+            <w:pPr>
+              <w:rPr>
+                <w:rFonts w:ascii="Times New Roman" w:hAnsi="Times New Roman" w:cs="Times New Roman"/>
+              </w:rPr>
+            </w:pPr>
+            <w:r>
+              <w:rPr>
+                <w:rFonts w:ascii="Times New Roman" w:hAnsi="Times New Roman" w:cs="Times New Roman"/>
+              </w:rPr>
+              <w:t xml:space="preserve">26 </w:t>
+            </w:r>
+            <w:proofErr w:type="spellStart"/>
+            <w:r>
+              <w:rPr>
+                <w:rFonts w:ascii="Times New Roman" w:hAnsi="Times New Roman" w:cs="Times New Roman"/>
+              </w:rPr>
+              <w:t>ago</w:t>
+            </w:r>
+            <w:proofErr w:type="spellEnd"/>
+            <w:r>
+              <w:rPr>
+                <w:rFonts w:ascii="Times New Roman" w:hAnsi="Times New Roman" w:cs="Times New Roman"/>
+              </w:rPr>
+              <w:t xml:space="preserve">–1 </w:t>
+            </w:r>
+            <w:proofErr w:type="spellStart"/>
+            <w:r>
+              <w:rPr>
+                <w:rFonts w:ascii="Times New Roman" w:hAnsi="Times New Roman" w:cs="Times New Roman"/>
+              </w:rPr>
+              <w:t>sep</w:t>
+            </w:r>
+            <w:proofErr w:type="spellEnd"/>
+          </w:p>
+        </w:tc>
+        <w:tc>
+          <w:tcPr>
+            <w:tcW w:w="0" w:type="auto"/>
+            <w:vAlign w:val="center"/>
+          </w:tcPr>
+          <w:p>
+            <w:pPr>
+              <w:rPr>
+                <w:rFonts w:ascii="Times New Roman" w:hAnsi="Times New Roman" w:cs="Times New Roman"/>
+              </w:rPr>
+            </w:pPr>
+            <w:r>
+              <w:rPr>
+                <w:rFonts w:ascii="Times New Roman" w:hAnsi="Times New Roman" w:cs="Times New Roman"/>
+              </w:rPr>
+              <w:t>Limpieza e integración de datos (nulos, duplicados, normalización), control de versiones en Git, Bitácora de Error #2 — cierre Unidad 2</w:t>
+            </w:r>
+          </w:p>
+        </w:tc>
+        <w:tc>
+          <w:tcPr>
+            <w:tcW w:w="0" w:type="auto"/>
+            <w:vAlign w:val="center"/>
+          </w:tcPr>
+          <w:p>
+            <w:pPr>
+              <w:rPr>
+                <w:rFonts w:ascii="Times New Roman" w:hAnsi="Times New Roman" w:cs="Times New Roman"/>
+              </w:rPr>
+            </w:pPr>
+            <w:r>
+              <w:rPr>
+                <w:rFonts w:ascii="Times New Roman" w:hAnsi="Times New Roman" w:cs="Times New Roman"/>
+              </w:rPr>
+              <w:t>Néstor / Ivanna</w:t>
+            </w:r>
+          </w:p>
+        </w:tc>
+      </w:tr>
+      <w:tr>
+        <w:trPr>
+          <w:tblCellSpacing w:w="15" w:type="dxa"/>
+        </w:trPr>
+        <w:tc>
+          <w:tcPr>
+            <w:tcW w:w="0" w:type="auto"/>
+            <w:vAlign w:val="center"/>
+          </w:tcPr>
+          <w:p>
+            <w:pPr>
+              <w:rPr>
+                <w:rFonts w:ascii="Times New Roman" w:hAnsi="Times New Roman" w:cs="Times New Roman"/>
+              </w:rPr>
+            </w:pPr>
+            <w:r>
+              <w:rPr>
+                <w:rFonts w:ascii="Times New Roman" w:hAnsi="Times New Roman" w:cs="Times New Roman"/>
+              </w:rPr>
+              <w:lastRenderedPageBreak/>
+              <w:t>7</w:t>
+            </w:r>
+          </w:p>
+        </w:tc>
+        <w:tc>
+          <w:tcPr>
+            <w:tcW w:w="0" w:type="auto"/>
+            <w:vAlign w:val="center"/>
+          </w:tcPr>
+          <w:p>
+            <w:pPr>
+              <w:rPr>
+                <w:rFonts w:ascii="Times New Roman" w:hAnsi="Times New Roman" w:cs="Times New Roman"/>
+              </w:rPr>
+            </w:pPr>
+            <w:r>
+              <w:rPr>
+                <w:rFonts w:ascii="Times New Roman" w:hAnsi="Times New Roman" w:cs="Times New Roman"/>
+              </w:rPr>
+              <w:t xml:space="preserve">2–8 </w:t>
+            </w:r>
+            <w:proofErr w:type="spellStart"/>
+            <w:r>
+              <w:rPr>
+                <w:rFonts w:ascii="Times New Roman" w:hAnsi="Times New Roman" w:cs="Times New Roman"/>
+              </w:rPr>
+              <w:t>sep</w:t>
+            </w:r>
+            <w:proofErr w:type="spellEnd"/>
+          </w:p>
+        </w:tc>
+        <w:tc>
+          <w:tcPr>
+            <w:tcW w:w="0" w:type="auto"/>
+            <w:vAlign w:val="center"/>
+          </w:tcPr>
+          <w:p>
+            <w:pPr>
+              <w:rPr>
+                <w:rFonts w:ascii="Times New Roman" w:hAnsi="Times New Roman" w:cs="Times New Roman"/>
+              </w:rPr>
+            </w:pPr>
+            <w:r>
+              <w:rPr>
+                <w:rFonts w:ascii="Times New Roman" w:hAnsi="Times New Roman" w:cs="Times New Roman"/>
+              </w:rPr>
+              <w:t>Taller de análisis exploratorio (EDA): estadísticos descriptivos y mínimo 6 visualizaciones comentadas</w:t>
+            </w:r>
+          </w:p>
+        </w:tc>
+        <w:tc>
+          <w:tcPr>
+            <w:tcW w:w="0" w:type="auto"/>
+            <w:vAlign w:val="center"/>
+          </w:tcPr>
+          <w:p>
+            <w:pPr>
+              <w:rPr>
+                <w:rFonts w:ascii="Times New Roman" w:hAnsi="Times New Roman" w:cs="Times New Roman"/>
+              </w:rPr>
+            </w:pPr>
+            <w:r>
+              <w:rPr>
+                <w:rFonts w:ascii="Times New Roman" w:hAnsi="Times New Roman" w:cs="Times New Roman"/>
+              </w:rPr>
+              <w:t>Ivanna / Néstor</w:t>
+            </w:r>
+          </w:p>
+        </w:tc>
+      </w:tr>
+      <w:tr>
+        <w:trPr>
+          <w:tblCellSpacing w:w="15" w:type="dxa"/>
+        </w:trPr>
+        <w:tc>
+          <w:tcPr>
+            <w:tcW w:w="0" w:type="auto"/>
+            <w:vAlign w:val="center"/>
+          </w:tcPr>
+          <w:p>
+            <w:pPr>
+              <w:rPr>
+                <w:rFonts w:ascii="Times New Roman" w:hAnsi="Times New Roman" w:cs="Times New Roman"/>
+              </w:rPr>
+            </w:pPr>
+            <w:r>
+              <w:rPr>
+                <w:rFonts w:ascii="Times New Roman" w:hAnsi="Times New Roman" w:cs="Times New Roman"/>
+              </w:rPr>
+              <w:t>8</w:t>
+            </w:r>
+          </w:p>
+        </w:tc>
+        <w:tc>
+          <w:tcPr>
+            <w:tcW w:w="0" w:type="auto"/>
+            <w:vAlign w:val="center"/>
+          </w:tcPr>
+          <w:p>
+            <w:pPr>
+              <w:rPr>
+                <w:rFonts w:ascii="Times New Roman" w:hAnsi="Times New Roman" w:cs="Times New Roman"/>
+              </w:rPr>
+            </w:pPr>
+            <w:r>
+              <w:rPr>
+                <w:rFonts w:ascii="Times New Roman" w:hAnsi="Times New Roman" w:cs="Times New Roman"/>
+              </w:rPr>
+              <w:t xml:space="preserve">9–15 </w:t>
+            </w:r>
+            <w:proofErr w:type="spellStart"/>
+            <w:r>
+              <w:rPr>
+                <w:rFonts w:ascii="Times New Roman" w:hAnsi="Times New Roman" w:cs="Times New Roman"/>
+              </w:rPr>
+              <w:t>sep</w:t>
+            </w:r>
+            <w:proofErr w:type="spellEnd"/>
+          </w:p>
+        </w:tc>
+        <w:tc>
+          <w:tcPr>
+            <w:tcW w:w="0" w:type="auto"/>
+            <w:vAlign w:val="center"/>
+          </w:tcPr>
+          <w:p>
+            <w:pPr>
+              <w:rPr>
+                <w:rFonts w:ascii="Times New Roman" w:hAnsi="Times New Roman" w:cs="Times New Roman"/>
+              </w:rPr>
+            </w:pPr>
+            <w:r>
+              <w:rPr>
+                <w:rFonts w:ascii="Times New Roman" w:hAnsi="Times New Roman" w:cs="Times New Roman"/>
+              </w:rPr>
+              <w:t>EDA integrado (8 visualizaciones), preparación de variables (</w:t>
+            </w:r>
+            <w:proofErr w:type="spellStart"/>
+            <w:r>
+              <w:rPr>
+                <w:rFonts w:ascii="Times New Roman" w:hAnsi="Times New Roman" w:cs="Times New Roman"/>
+              </w:rPr>
+              <w:t>feature</w:t>
+            </w:r>
+            <w:proofErr w:type="spellEnd"/>
+            <w:r>
+              <w:rPr>
+                <w:rFonts w:ascii="Times New Roman" w:hAnsi="Times New Roman" w:cs="Times New Roman"/>
+              </w:rPr>
+              <w:t xml:space="preserve"> </w:t>
+            </w:r>
+            <w:proofErr w:type="spellStart"/>
+            <w:r>
+              <w:rPr>
+                <w:rFonts w:ascii="Times New Roman" w:hAnsi="Times New Roman" w:cs="Times New Roman"/>
+              </w:rPr>
+              <w:t>engineering</w:t>
+            </w:r>
+            <w:proofErr w:type="spellEnd"/>
+            <w:r>
+              <w:rPr>
+                <w:rFonts w:ascii="Times New Roman" w:hAnsi="Times New Roman" w:cs="Times New Roman"/>
+              </w:rPr>
+              <w:t>) para el modelo de clasificación</w:t>
+            </w:r>
+          </w:p>
+        </w:tc>
+        <w:tc>
+          <w:tcPr>
+            <w:tcW w:w="0" w:type="auto"/>
+            <w:vAlign w:val="center"/>
+          </w:tcPr>
+          <w:p>
+            <w:pPr>
+              <w:rPr>
+                <w:rFonts w:ascii="Times New Roman" w:hAnsi="Times New Roman" w:cs="Times New Roman"/>
+              </w:rPr>
+            </w:pPr>
+            <w:r>
+              <w:rPr>
+                <w:rFonts w:ascii="Times New Roman" w:hAnsi="Times New Roman" w:cs="Times New Roman"/>
+              </w:rPr>
+              <w:t>Ivanna</w:t>
+            </w:r>
+          </w:p>
+        </w:tc>
+      </w:tr>
+      <w:tr>
+        <w:trPr>
+          <w:tblCellSpacing w:w="15" w:type="dxa"/>
+        </w:trPr>
+        <w:tc>
+          <w:tcPr>
+            <w:tcW w:w="0" w:type="auto"/>
+            <w:vAlign w:val="center"/>
+          </w:tcPr>
+          <w:p>
+            <w:pPr>
+              <w:rPr>
+                <w:rFonts w:ascii="Times New Roman" w:hAnsi="Times New Roman" w:cs="Times New Roman"/>
+              </w:rPr>
+            </w:pPr>
+            <w:r>
+              <w:rPr>
+                <w:rFonts w:ascii="Times New Roman" w:hAnsi="Times New Roman" w:cs="Times New Roman"/>
+              </w:rPr>
+              <w:t>9</w:t>
+            </w:r>
+          </w:p>
+        </w:tc>
+        <w:tc>
+          <w:tcPr>
+            <w:tcW w:w="0" w:type="auto"/>
+            <w:vAlign w:val="center"/>
+          </w:tcPr>
+          <w:p>
+            <w:pPr>
+              <w:rPr>
+                <w:rFonts w:ascii="Times New Roman" w:hAnsi="Times New Roman" w:cs="Times New Roman"/>
+              </w:rPr>
+            </w:pPr>
+            <w:r>
+              <w:rPr>
+                <w:rFonts w:ascii="Times New Roman" w:hAnsi="Times New Roman" w:cs="Times New Roman"/>
+              </w:rPr>
+              <w:t xml:space="preserve">16–22 </w:t>
+            </w:r>
+            <w:proofErr w:type="spellStart"/>
+            <w:r>
+              <w:rPr>
+                <w:rFonts w:ascii="Times New Roman" w:hAnsi="Times New Roman" w:cs="Times New Roman"/>
+              </w:rPr>
+              <w:t>sep</w:t>
+            </w:r>
+            <w:proofErr w:type="spellEnd"/>
+          </w:p>
+        </w:tc>
+        <w:tc>
+          <w:tcPr>
+            <w:tcW w:w="0" w:type="auto"/>
+            <w:vAlign w:val="center"/>
+          </w:tcPr>
+          <w:p>
+            <w:pPr>
+              <w:rPr>
+                <w:rFonts w:ascii="Times New Roman" w:hAnsi="Times New Roman" w:cs="Times New Roman"/>
+              </w:rPr>
+            </w:pPr>
+            <w:r>
+              <w:rPr>
+                <w:rFonts w:ascii="Times New Roman" w:hAnsi="Times New Roman" w:cs="Times New Roman"/>
+              </w:rPr>
+              <w:t>Consolidación de la caracterización de patrones de compra por categoría, canal, dispositivo y ciudad (Objetivo 1) — entrega antes del 22 de septiembre</w:t>
+            </w:r>
+          </w:p>
+        </w:tc>
+        <w:tc>
+          <w:tcPr>
+            <w:tcW w:w="0" w:type="auto"/>
+            <w:vAlign w:val="center"/>
+          </w:tcPr>
+          <w:p>
+            <w:pPr>
+              <w:rPr>
+                <w:rFonts w:ascii="Times New Roman" w:hAnsi="Times New Roman" w:cs="Times New Roman"/>
+              </w:rPr>
+            </w:pPr>
+            <w:r>
+              <w:rPr>
+                <w:rFonts w:ascii="Times New Roman" w:hAnsi="Times New Roman" w:cs="Times New Roman"/>
+              </w:rPr>
+              <w:t>Néstor / Ivanna</w:t>
+            </w:r>
+          </w:p>
+        </w:tc>
+      </w:tr>
+      <w:tr>
+        <w:trPr>
+          <w:tblCellSpacing w:w="15" w:type="dxa"/>
+        </w:trPr>
+        <w:tc>
+          <w:tcPr>
+            <w:tcW w:w="0" w:type="auto"/>
+            <w:vAlign w:val="center"/>
+          </w:tcPr>
+          <w:p>
+            <w:pPr>
+              <w:rPr>
+                <w:rFonts w:ascii="Times New Roman" w:hAnsi="Times New Roman" w:cs="Times New Roman"/>
+              </w:rPr>
+            </w:pPr>
+            <w:r>
+              <w:rPr>
+                <w:rFonts w:ascii="Times New Roman" w:hAnsi="Times New Roman" w:cs="Times New Roman"/>
+              </w:rPr>
+              <w:t>10</w:t>
+            </w:r>
+          </w:p>
+        </w:tc>
+        <w:tc>
+          <w:tcPr>
+            <w:tcW w:w="0" w:type="auto"/>
+            <w:vAlign w:val="center"/>
+          </w:tcPr>
+          <w:p>
+            <w:pPr>
+              <w:rPr>
+                <w:rFonts w:ascii="Times New Roman" w:hAnsi="Times New Roman" w:cs="Times New Roman"/>
+              </w:rPr>
+            </w:pPr>
+            <w:r>
+              <w:rPr>
+                <w:rFonts w:ascii="Times New Roman" w:hAnsi="Times New Roman" w:cs="Times New Roman"/>
+              </w:rPr>
+              <w:t xml:space="preserve">23–29 </w:t>
+            </w:r>
+            <w:proofErr w:type="spellStart"/>
+            <w:r>
+              <w:rPr>
+                <w:rFonts w:ascii="Times New Roman" w:hAnsi="Times New Roman" w:cs="Times New Roman"/>
+              </w:rPr>
+              <w:t>sep</w:t>
+            </w:r>
+            <w:proofErr w:type="spellEnd"/>
+          </w:p>
+        </w:tc>
+        <w:tc>
+          <w:tcPr>
+            <w:tcW w:w="0" w:type="auto"/>
+            <w:vAlign w:val="center"/>
+          </w:tcPr>
+          <w:p>
+            <w:pPr>
+              <w:rPr>
+                <w:rFonts w:ascii="Times New Roman" w:hAnsi="Times New Roman" w:cs="Times New Roman"/>
+              </w:rPr>
+            </w:pPr>
+            <w:r>
+              <w:rPr>
+                <w:rFonts w:ascii="Times New Roman" w:hAnsi="Times New Roman" w:cs="Times New Roman"/>
+              </w:rPr>
+              <w:t>Análisis de la relación entre tiempo de entrega, devolución y calificación del cliente, con prueba de significancia p &lt; 0.05 (Objetivo 3) — entrega antes del 29 de septiembre</w:t>
+            </w:r>
+          </w:p>
+        </w:tc>
+        <w:tc>
+          <w:tcPr>
+            <w:tcW w:w="0" w:type="auto"/>
+            <w:vAlign w:val="center"/>
+          </w:tcPr>
+          <w:p>
+            <w:pPr>
+              <w:rPr>
+                <w:rFonts w:ascii="Times New Roman" w:hAnsi="Times New Roman" w:cs="Times New Roman"/>
+              </w:rPr>
+            </w:pPr>
+            <w:r>
+              <w:rPr>
+                <w:rFonts w:ascii="Times New Roman" w:hAnsi="Times New Roman" w:cs="Times New Roman"/>
+              </w:rPr>
+              <w:t>Ivanna</w:t>
+            </w:r>
+          </w:p>
+        </w:tc>
+      </w:tr>
+      <w:tr>
+        <w:trPr>
+          <w:tblCellSpacing w:w="15" w:type="dxa"/>
+        </w:trPr>
+        <w:tc>
+          <w:tcPr>
+            <w:tcW w:w="0" w:type="auto"/>
+            <w:vAlign w:val="center"/>
+          </w:tcPr>
+          <w:p>
+            <w:pPr>
+              <w:rPr>
+                <w:rFonts w:ascii="Times New Roman" w:hAnsi="Times New Roman" w:cs="Times New Roman"/>
+              </w:rPr>
+            </w:pPr>
+            <w:r>
+              <w:rPr>
+                <w:rFonts w:ascii="Times New Roman" w:hAnsi="Times New Roman" w:cs="Times New Roman"/>
+              </w:rPr>
+              <w:t>11</w:t>
+            </w:r>
+          </w:p>
+        </w:tc>
+        <w:tc>
+          <w:tcPr>
+            <w:tcW w:w="0" w:type="auto"/>
+            <w:vAlign w:val="center"/>
+          </w:tcPr>
+          <w:p>
+            <w:pPr>
+              <w:rPr>
+                <w:rFonts w:ascii="Times New Roman" w:hAnsi="Times New Roman" w:cs="Times New Roman"/>
+              </w:rPr>
+            </w:pPr>
+            <w:r>
+              <w:rPr>
+                <w:rFonts w:ascii="Times New Roman" w:hAnsi="Times New Roman" w:cs="Times New Roman"/>
+              </w:rPr>
+              <w:t xml:space="preserve">30 </w:t>
+            </w:r>
+            <w:proofErr w:type="spellStart"/>
+            <w:r>
+              <w:rPr>
+                <w:rFonts w:ascii="Times New Roman" w:hAnsi="Times New Roman" w:cs="Times New Roman"/>
+              </w:rPr>
+              <w:t>sep</w:t>
+            </w:r>
+            <w:proofErr w:type="spellEnd"/>
+            <w:r>
+              <w:rPr>
+                <w:rFonts w:ascii="Times New Roman" w:hAnsi="Times New Roman" w:cs="Times New Roman"/>
+              </w:rPr>
+              <w:t>–6 oct</w:t>
+            </w:r>
+          </w:p>
+        </w:tc>
+        <w:tc>
+          <w:tcPr>
+            <w:tcW w:w="0" w:type="auto"/>
+            <w:vAlign w:val="center"/>
+          </w:tcPr>
+          <w:p>
+            <w:pPr>
+              <w:rPr>
+                <w:rFonts w:ascii="Times New Roman" w:hAnsi="Times New Roman" w:cs="Times New Roman"/>
+              </w:rPr>
+            </w:pPr>
+            <w:r>
+              <w:rPr>
+                <w:rFonts w:ascii="Times New Roman" w:hAnsi="Times New Roman" w:cs="Times New Roman"/>
+              </w:rPr>
+              <w:t>Entrenamiento inicial del modelo de clasificación de devoluciones (selección de algoritmo, balanceo de clases)</w:t>
+            </w:r>
+          </w:p>
+        </w:tc>
+        <w:tc>
+          <w:tcPr>
+            <w:tcW w:w="0" w:type="auto"/>
+            <w:vAlign w:val="center"/>
+          </w:tcPr>
+          <w:p>
+            <w:pPr>
+              <w:rPr>
+                <w:rFonts w:ascii="Times New Roman" w:hAnsi="Times New Roman" w:cs="Times New Roman"/>
+              </w:rPr>
+            </w:pPr>
+            <w:r>
+              <w:rPr>
+                <w:rFonts w:ascii="Times New Roman" w:hAnsi="Times New Roman" w:cs="Times New Roman"/>
+              </w:rPr>
+              <w:t>Néstor</w:t>
+            </w:r>
+          </w:p>
+        </w:tc>
+      </w:tr>
+      <w:tr>
+        <w:trPr>
+          <w:tblCellSpacing w:w="15" w:type="dxa"/>
+        </w:trPr>
+        <w:tc>
+          <w:tcPr>
+            <w:tcW w:w="0" w:type="auto"/>
+            <w:vAlign w:val="center"/>
+          </w:tcPr>
+          <w:p>
+            <w:pPr>
+              <w:rPr>
+                <w:rFonts w:ascii="Times New Roman" w:hAnsi="Times New Roman" w:cs="Times New Roman"/>
+              </w:rPr>
+            </w:pPr>
+            <w:r>
+              <w:rPr>
+                <w:rFonts w:ascii="Times New Roman" w:hAnsi="Times New Roman" w:cs="Times New Roman"/>
+              </w:rPr>
+              <w:t>12</w:t>
+            </w:r>
+          </w:p>
+        </w:tc>
+        <w:tc>
+          <w:tcPr>
+            <w:tcW w:w="0" w:type="auto"/>
+            <w:vAlign w:val="center"/>
+          </w:tcPr>
+          <w:p>
+            <w:pPr>
+              <w:rPr>
+                <w:rFonts w:ascii="Times New Roman" w:hAnsi="Times New Roman" w:cs="Times New Roman"/>
+              </w:rPr>
+            </w:pPr>
+            <w:r>
+              <w:rPr>
+                <w:rFonts w:ascii="Times New Roman" w:hAnsi="Times New Roman" w:cs="Times New Roman"/>
+              </w:rPr>
+              <w:t>7–13 oct</w:t>
+            </w:r>
+          </w:p>
+        </w:tc>
+        <w:tc>
+          <w:tcPr>
+            <w:tcW w:w="0" w:type="auto"/>
+            <w:vAlign w:val="center"/>
+          </w:tcPr>
+          <w:p>
+            <w:pPr>
+              <w:rPr>
+                <w:rFonts w:ascii="Times New Roman" w:hAnsi="Times New Roman" w:cs="Times New Roman"/>
+              </w:rPr>
+            </w:pPr>
+            <w:r>
+              <w:rPr>
+                <w:rFonts w:ascii="Times New Roman" w:hAnsi="Times New Roman" w:cs="Times New Roman"/>
+              </w:rPr>
+              <w:t xml:space="preserve">Validación y ajuste del modelo (métricas AUC-ROC, matriz de confusión, optimización de </w:t>
+            </w:r>
+            <w:proofErr w:type="spellStart"/>
+            <w:r>
+              <w:rPr>
+                <w:rFonts w:ascii="Times New Roman" w:hAnsi="Times New Roman" w:cs="Times New Roman"/>
+              </w:rPr>
+              <w:t>hiperparámetros</w:t>
+            </w:r>
+            <w:proofErr w:type="spellEnd"/>
+            <w:r>
+              <w:rPr>
+                <w:rFonts w:ascii="Times New Roman" w:hAnsi="Times New Roman" w:cs="Times New Roman"/>
+              </w:rPr>
+              <w:t>)</w:t>
+            </w:r>
+          </w:p>
+        </w:tc>
+        <w:tc>
+          <w:tcPr>
+            <w:tcW w:w="0" w:type="auto"/>
+            <w:vAlign w:val="center"/>
+          </w:tcPr>
+          <w:p>
+            <w:pPr>
+              <w:rPr>
+                <w:rFonts w:ascii="Times New Roman" w:hAnsi="Times New Roman" w:cs="Times New Roman"/>
+              </w:rPr>
+            </w:pPr>
+            <w:r>
+              <w:rPr>
+                <w:rFonts w:ascii="Times New Roman" w:hAnsi="Times New Roman" w:cs="Times New Roman"/>
+              </w:rPr>
+              <w:t>Néstor / Ivanna</w:t>
+            </w:r>
+          </w:p>
+        </w:tc>
+      </w:tr>
+      <w:tr>
+        <w:trPr>
+          <w:tblCellSpacing w:w="15" w:type="dxa"/>
+        </w:trPr>
+        <w:tc>
+          <w:tcPr>
+            <w:tcW w:w="0" w:type="auto"/>
+            <w:vAlign w:val="center"/>
+          </w:tcPr>
+          <w:p>
+            <w:pPr>
+              <w:rPr>
+                <w:rFonts w:ascii="Times New Roman" w:hAnsi="Times New Roman" w:cs="Times New Roman"/>
+              </w:rPr>
+            </w:pPr>
+            <w:r>
+              <w:rPr>
+                <w:rFonts w:ascii="Times New Roman" w:hAnsi="Times New Roman" w:cs="Times New Roman"/>
+              </w:rPr>
+              <w:t>13</w:t>
+            </w:r>
+          </w:p>
+        </w:tc>
+        <w:tc>
+          <w:tcPr>
+            <w:tcW w:w="0" w:type="auto"/>
+            <w:vAlign w:val="center"/>
+          </w:tcPr>
+          <w:p>
+            <w:pPr>
+              <w:rPr>
+                <w:rFonts w:ascii="Times New Roman" w:hAnsi="Times New Roman" w:cs="Times New Roman"/>
+              </w:rPr>
+            </w:pPr>
+            <w:r>
+              <w:rPr>
+                <w:rFonts w:ascii="Times New Roman" w:hAnsi="Times New Roman" w:cs="Times New Roman"/>
+              </w:rPr>
+              <w:t>14–20 oct</w:t>
+            </w:r>
+          </w:p>
+        </w:tc>
+        <w:tc>
+          <w:tcPr>
+            <w:tcW w:w="0" w:type="auto"/>
+            <w:vAlign w:val="center"/>
+          </w:tcPr>
+          <w:p>
+            <w:pPr>
+              <w:rPr>
+                <w:rFonts w:ascii="Times New Roman" w:hAnsi="Times New Roman" w:cs="Times New Roman"/>
+              </w:rPr>
+            </w:pPr>
+            <w:r>
+              <w:rPr>
+                <w:rFonts w:ascii="Times New Roman" w:hAnsi="Times New Roman" w:cs="Times New Roman"/>
+              </w:rPr>
+              <w:t>Consolidación del modelo de clasificación con AUC-ROC &gt; 0.75 (Objetivo 2) — entrega antes del 20 de octubre</w:t>
+            </w:r>
+          </w:p>
+        </w:tc>
+        <w:tc>
+          <w:tcPr>
+            <w:tcW w:w="0" w:type="auto"/>
+            <w:vAlign w:val="center"/>
+          </w:tcPr>
+          <w:p>
+            <w:pPr>
+              <w:rPr>
+                <w:rFonts w:ascii="Times New Roman" w:hAnsi="Times New Roman" w:cs="Times New Roman"/>
+              </w:rPr>
+            </w:pPr>
+            <w:r>
+              <w:rPr>
+                <w:rFonts w:ascii="Times New Roman" w:hAnsi="Times New Roman" w:cs="Times New Roman"/>
+              </w:rPr>
+              <w:t>Néstor / Ivanna</w:t>
+            </w:r>
+          </w:p>
+        </w:tc>
+      </w:tr>
+      <w:tr>
+        <w:trPr>
+          <w:tblCellSpacing w:w="15" w:type="dxa"/>
+        </w:trPr>
+        <w:tc>
+          <w:tcPr>
+            <w:tcW w:w="0" w:type="auto"/>
+            <w:vAlign w:val="center"/>
+          </w:tcPr>
+          <w:p>
+            <w:pPr>
+              <w:rPr>
+                <w:rFonts w:ascii="Times New Roman" w:hAnsi="Times New Roman" w:cs="Times New Roman"/>
+              </w:rPr>
+            </w:pPr>
+            <w:r>
+              <w:rPr>
+                <w:rFonts w:ascii="Times New Roman" w:hAnsi="Times New Roman" w:cs="Times New Roman"/>
+              </w:rPr>
+              <w:t>14</w:t>
+            </w:r>
+          </w:p>
+        </w:tc>
+        <w:tc>
+          <w:tcPr>
+            <w:tcW w:w="0" w:type="auto"/>
+            <w:vAlign w:val="center"/>
+          </w:tcPr>
+          <w:p>
+            <w:pPr>
+              <w:rPr>
+                <w:rFonts w:ascii="Times New Roman" w:hAnsi="Times New Roman" w:cs="Times New Roman"/>
+              </w:rPr>
+            </w:pPr>
+            <w:r>
+              <w:rPr>
+                <w:rFonts w:ascii="Times New Roman" w:hAnsi="Times New Roman" w:cs="Times New Roman"/>
+              </w:rPr>
+              <w:t>21–27 oct</w:t>
+            </w:r>
+          </w:p>
+        </w:tc>
+        <w:tc>
+          <w:tcPr>
+            <w:tcW w:w="0" w:type="auto"/>
+            <w:vAlign w:val="center"/>
+          </w:tcPr>
+          <w:p>
+            <w:pPr>
+              <w:rPr>
+                <w:rFonts w:ascii="Times New Roman" w:hAnsi="Times New Roman" w:cs="Times New Roman"/>
+              </w:rPr>
+            </w:pPr>
+            <w:r>
+              <w:rPr>
+                <w:rFonts w:ascii="Times New Roman" w:hAnsi="Times New Roman" w:cs="Times New Roman"/>
+              </w:rPr>
+              <w:t xml:space="preserve">Construcción de </w:t>
+            </w:r>
+            <w:proofErr w:type="spellStart"/>
+            <w:r>
+              <w:rPr>
+                <w:rFonts w:ascii="Times New Roman" w:hAnsi="Times New Roman" w:cs="Times New Roman"/>
+              </w:rPr>
+              <w:t>dashboards</w:t>
+            </w:r>
+            <w:proofErr w:type="spellEnd"/>
+            <w:r>
+              <w:rPr>
+                <w:rFonts w:ascii="Times New Roman" w:hAnsi="Times New Roman" w:cs="Times New Roman"/>
+              </w:rPr>
+              <w:t xml:space="preserve"> de visualización, redacción final, revisión de pares (peer </w:t>
+            </w:r>
+            <w:proofErr w:type="spellStart"/>
+            <w:r>
+              <w:rPr>
+                <w:rFonts w:ascii="Times New Roman" w:hAnsi="Times New Roman" w:cs="Times New Roman"/>
+              </w:rPr>
+              <w:t>review</w:t>
+            </w:r>
+            <w:proofErr w:type="spellEnd"/>
+            <w:r>
+              <w:rPr>
+                <w:rFonts w:ascii="Times New Roman" w:hAnsi="Times New Roman" w:cs="Times New Roman"/>
+              </w:rPr>
+              <w:t>) y entrega del Entregable 2 (cierre del proyecto)</w:t>
+            </w:r>
+          </w:p>
+        </w:tc>
+        <w:tc>
+          <w:tcPr>
+            <w:tcW w:w="0" w:type="auto"/>
+            <w:vAlign w:val="center"/>
+          </w:tcPr>
+          <w:p>
+            <w:pPr>
+              <w:rPr>
+                <w:rFonts w:ascii="Times New Roman" w:hAnsi="Times New Roman" w:cs="Times New Roman"/>
+              </w:rPr>
+            </w:pPr>
+            <w:r>
+              <w:rPr>
+                <w:rFonts w:ascii="Times New Roman" w:hAnsi="Times New Roman" w:cs="Times New Roman"/>
+              </w:rPr>
+              <w:t>Ivanna / Néstor</w:t>
+            </w:r>
+          </w:p>
+        </w:tc>
+      </w:tr>
+    </w:tbl>
+    <w:p>
+      <w:pPr>
+        <w:rPr>
+          <w:rFonts w:ascii="Times New Roman" w:hAnsi="Times New Roman" w:cs="Times New Roman"/>
+        </w:rPr>
+      </w:pPr>
+      <w:r>
+        <w:rPr>
+          <w:rFonts w:ascii="Times New Roman" w:hAnsi="Times New Roman" w:cs="Times New Roman"/>
+        </w:rPr>
+        <w:t xml:space="preserve">Entregable si se extiende el sprint: caracterización de patrones de compra, análisis de relación tiempo de entrega–devolución–calificación, modelo predictivo de devoluciones validado (AUC-ROC &gt; 0.75) y Entregable 2 (documento final) con </w:t>
+      </w:r>
+      <w:proofErr w:type="spellStart"/>
+      <w:r>
+        <w:rPr>
+          <w:rFonts w:ascii="Times New Roman" w:hAnsi="Times New Roman" w:cs="Times New Roman"/>
+        </w:rPr>
+        <w:t>dashboards</w:t>
+      </w:r>
+      <w:proofErr w:type="spellEnd"/>
+      <w:r>
+        <w:rPr>
+          <w:rFonts w:ascii="Times New Roman" w:hAnsi="Times New Roman" w:cs="Times New Roman"/>
+        </w:rPr>
+        <w:t xml:space="preserve"> de visualización.</w:t>
+      </w:r>
+    </w:p>
+    <w:p>
+      <w:pPr>
+        <w:rPr>
+          <w:rFonts w:ascii="Times New Roman" w:hAnsi="Times New Roman" w:cs="Times New Roman"/>
+          <w:b/>
+          <w:bCs/>
+        </w:rPr>
+      </w:pPr>
+      <w:r>
+        <w:rPr>
+          <w:rFonts w:ascii="Times New Roman" w:hAnsi="Times New Roman" w:cs="Times New Roman"/>
+          <w:b/>
+          <w:bCs/>
+        </w:rPr>
+        <w:t>Opción B — Cronograma corto (semanas 6–8, hasta el 16 de septiembre, versión original)</w:t>
+      </w:r>
+    </w:p>
     <w:tbl>
       <w:tblPr>
         <w:tblW w:w="0" w:type="auto"/>
@@ -910,6 +2053,7 @@
                 <w:b/>
                 <w:bCs/>
               </w:rPr>
+              <w:lastRenderedPageBreak/>
               <w:t>Semana</w:t>
             </w:r>
           </w:p>
@@ -1215,7 +2359,6 @@
               <w:rPr>
                 <w:rFonts w:ascii="Times New Roman" w:hAnsi="Times New Roman" w:cs="Times New Roman"/>
               </w:rPr>
-              <w:lastRenderedPageBreak/>
               <w:t>8</w:t>
             </w:r>
           </w:p>
@@ -2038,6 +3181,7 @@
   <w:style w:type="character" w:default="1" w:styleId="Fuentedeprrafopredeter">
     <w:name w:val="Default Paragraph Font"/>
     <w:uiPriority w:val="1"/>
+    <w:semiHidden/>
     <w:unhideWhenUsed/>
   </w:style>
   <w:style w:type="table" w:default="1" w:styleId="Tablanormal">

</xml_diff>